<commit_message>
refactor: update industry manager resume template with detailed content and improved formatting
</commit_message>
<xml_diff>
--- a/templates/industry_manager_resume_bracket.docx
+++ b/templates/industry_manager_resume_bracket.docx
@@ -1,6 +1,6 @@
 
 <file path=word/document.xml><?xml version="1.0" encoding="utf-8"?>
-<w:document xmlns:wpc="http://schemas.microsoft.com/office/word/2010/wordprocessingCanvas" xmlns:cx="http://schemas.microsoft.com/office/drawing/2014/chartex" xmlns:cx1="http://schemas.microsoft.com/office/drawing/2015/9/8/chartex" xmlns:cx2="http://schemas.microsoft.com/office/drawing/2015/10/21/chartex" xmlns:cx3="http://schemas.microsoft.com/office/drawing/2016/5/9/chartex" xmlns:cx4="http://schemas.microsoft.com/office/drawing/2016/5/10/chartex" xmlns:cx5="http://schemas.microsoft.com/office/drawing/2016/5/11/chartex" xmlns:cx6="http://schemas.microsoft.com/office/drawing/2016/5/12/chartex" xmlns:cx7="http://schemas.microsoft.com/office/drawing/2016/5/13/chartex" xmlns:cx8="http://schemas.microsoft.com/office/drawing/2016/5/14/chartex" xmlns:mc="http://schemas.openxmlformats.org/markup-compatibility/2006" xmlns:aink="http://schemas.microsoft.com/office/drawing/2016/ink" xmlns:am3d="http://schemas.microsoft.com/office/drawing/2017/model3d" xmlns:o="urn:schemas-microsoft-com:office:office" xmlns:oel="http://schemas.microsoft.com/office/2019/extlst" xmlns:r="http://schemas.openxmlformats.org/officeDocument/2006/relationships" xmlns:m="http://schemas.openxmlformats.org/officeDocument/2006/math" xmlns:v="urn:schemas-microsoft-com:vml" xmlns:wp14="http://schemas.microsoft.com/office/word/2010/wordprocessingDrawing" xmlns:wp="http://schemas.openxmlformats.org/drawingml/2006/wordprocessingDrawing" xmlns:w10="urn:schemas-microsoft-com:office:word" xmlns:w="http://schemas.openxmlformats.org/wordprocessingml/2006/main" xmlns:w14="http://schemas.microsoft.com/office/word/2010/wordml" xmlns:w15="http://schemas.microsoft.com/office/word/2012/wordml" xmlns:w16cex="http://schemas.microsoft.com/office/word/2018/wordml/cex" xmlns:w16cid="http://schemas.microsoft.com/office/word/2016/wordml/cid" xmlns:w16="http://schemas.microsoft.com/office/word/2018/wordml" xmlns:w16du="http://schemas.microsoft.com/office/word/2023/wordml/word16du" xmlns:w16sdtdh="http://schemas.microsoft.com/office/word/2020/wordml/sdtdatahash" xmlns:w16sdtfl="http://schemas.microsoft.com/office/word/2024/wordml/sdtformatlock" xmlns:w16se="http://schemas.microsoft.com/office/word/2015/wordml/symex" xmlns:wpg="http://schemas.microsoft.com/office/word/2010/wordprocessingGroup" xmlns:wpi="http://schemas.microsoft.com/office/word/2010/wordprocessingInk" xmlns:wne="http://schemas.microsoft.com/office/word/2006/wordml" xmlns:wps="http://schemas.microsoft.com/office/word/2010/wordprocessingShape" mc:Ignorable="w14 w15 w16se w16cid w16 w16cex w16sdtdh w16sdtfl w16du wp14">
+<w:document xmlns:wpc="http://schemas.microsoft.com/office/word/2010/wordprocessingCanvas" xmlns:cx="http://schemas.microsoft.com/office/drawing/2014/chartex" xmlns:cx1="http://schemas.microsoft.com/office/drawing/2015/9/8/chartex" xmlns:cx2="http://schemas.microsoft.com/office/drawing/2015/10/21/chartex" xmlns:cx3="http://schemas.microsoft.com/office/drawing/2016/5/9/chartex" xmlns:cx4="http://schemas.microsoft.com/office/drawing/2016/5/10/chartex" xmlns:cx5="http://schemas.microsoft.com/office/drawing/2016/5/11/chartex" xmlns:cx6="http://schemas.microsoft.com/office/drawing/2016/5/12/chartex" xmlns:cx7="http://schemas.microsoft.com/office/drawing/2016/5/13/chartex" xmlns:cx8="http://schemas.microsoft.com/office/drawing/2016/5/14/chartex" xmlns:mc="http://schemas.openxmlformats.org/markup-compatibility/2006" xmlns:aink="http://schemas.microsoft.com/office/drawing/2016/ink" xmlns:am3d="http://schemas.microsoft.com/office/drawing/2017/model3d" xmlns:o="urn:schemas-microsoft-com:office:office" xmlns:oel="http://schemas.microsoft.com/office/2019/extlst" xmlns:r="http://schemas.openxmlformats.org/officeDocument/2006/relationships" xmlns:m="http://schemas.openxmlformats.org/officeDocument/2006/math" xmlns:v="urn:schemas-microsoft-com:vml" xmlns:wp14="http://schemas.microsoft.com/office/word/2010/wordprocessingDrawing" xmlns:wp="http://schemas.openxmlformats.org/drawingml/2006/wordprocessingDrawing" xmlns:w10="urn:schemas-microsoft-com:office:word" xmlns:w="http://schemas.openxmlformats.org/wordprocessingml/2006/main" xmlns:w14="http://schemas.microsoft.com/office/word/2010/wordml" xmlns:w15="http://schemas.microsoft.com/office/word/2012/wordml" xmlns:w16cex="http://schemas.microsoft.com/office/word/2018/wordml/cex" xmlns:w16cid="http://schemas.microsoft.com/office/word/2016/wordml/cid" xmlns:w16="http://schemas.microsoft.com/office/word/2018/wordml" xmlns:w16du="http://schemas.microsoft.com/office/word/2023/wordml/word16du" xmlns:w16sdtdh="http://schemas.microsoft.com/office/word/2020/wordml/sdtdatahash" xmlns:w16se="http://schemas.microsoft.com/office/word/2015/wordml/symex" xmlns:wpg="http://schemas.microsoft.com/office/word/2010/wordprocessingGroup" xmlns:wpi="http://schemas.microsoft.com/office/word/2010/wordprocessingInk" xmlns:wne="http://schemas.microsoft.com/office/word/2006/wordml" xmlns:wps="http://schemas.microsoft.com/office/word/2010/wordprocessingShape" mc:Ignorable="w14 w15 w16se w16cid w16 w16cex w16sdtdh w16du wp14">
   <w:body>
     <w:tbl>
       <w:tblPr>
@@ -21,10 +21,10 @@
           </w:tcPr>
           <w:p>
             <w:pPr>
-              <w:pStyle w:val="a5"/>
+              <w:pStyle w:val="Title"/>
             </w:pPr>
             <w:r>
-              <w:t>[Name</w:t>
+              <w:t>May Riley</w:t>
             </w:r>
           </w:p>
         </w:tc>
@@ -35,29 +35,25 @@
         <w:pStyle w:val="Contact"/>
       </w:pPr>
       <w:r>
-        <w:t>[Email Address] | [Phone Number] | [LinkedIn or Portfolio URL]</w:t>
+        <w:t>4567 Main Street, Buffalo, New York 98052 | (716) 555-0100 | m.riley@live.com | www.linkedin.com/in/m.riley</w:t>
       </w:r>
     </w:p>
     <w:p>
       <w:pPr>
-        <w:pStyle w:val="1"/>
+        <w:pStyle w:val="Heading1"/>
       </w:pPr>
       <w:r>
         <w:t>Profile</w:t>
-      </w:r>
-      <w:r>
-        <w:br/>
-        <w:t>[Brief professional summary placeholder]</w:t>
       </w:r>
     </w:p>
     <w:p>
       <w:r>
-        <w:t>[Content Placeholder]</w:t>
+        <w:t>Friendly and engaging team player and leader able to inspire staff to perform their best. Detail oriented and experienced restaurant manager passionate about food and beverages. A multi-tasker who excels at staff training and recruiting with a track record of inspiring great customer service and customer satisfaction. Regularly exceed sales goals. A master in the art of upselling.</w:t>
       </w:r>
     </w:p>
     <w:p>
       <w:pPr>
-        <w:pStyle w:val="1"/>
+        <w:pStyle w:val="Heading1"/>
       </w:pPr>
       <w:r>
         <w:t>Experience</w:t>
@@ -65,95 +61,166 @@
     </w:p>
     <w:p>
       <w:pPr>
-        <w:pStyle w:val="2"/>
-      </w:pPr>
-      <w:r>
-        <w:t>[Job Title] | [Company Name] | [Dates]</w:t>
-      </w:r>
-      <w:r>
-        <w:br/>
-        <w:t>- [Responsibility or achievement #1]</w:t>
-      </w:r>
-      <w:r>
-        <w:br/>
-        <w:t>- [Responsibility or achievement #2]</w:t>
+        <w:pStyle w:val="Heading2"/>
+      </w:pPr>
+      <w:r>
+        <w:t>Restaurant Manager</w:t>
+      </w:r>
+      <w:r>
+        <w:t xml:space="preserve"> | </w:t>
+      </w:r>
+      <w:r>
+        <w:t>Contoso</w:t>
+      </w:r>
+      <w:r>
+        <w:rPr>
+          <w:caps w:val="0"/>
+        </w:rPr>
+        <w:t xml:space="preserve"> </w:t>
+      </w:r>
+      <w:r>
+        <w:t xml:space="preserve">Bar </w:t>
+      </w:r>
+      <w:r>
+        <w:t xml:space="preserve">and </w:t>
+      </w:r>
+      <w:r>
+        <w:t xml:space="preserve">Grill </w:t>
+      </w:r>
+      <w:r>
+        <w:t xml:space="preserve">| </w:t>
+      </w:r>
+      <w:r>
+        <w:t xml:space="preserve">September </w:t>
+      </w:r>
+      <w:r>
+        <w:t>20</w:t>
+      </w:r>
+      <w:r>
+        <w:t>XX</w:t>
+      </w:r>
+      <w:r>
+        <w:t xml:space="preserve"> </w:t>
+      </w:r>
+      <w:r>
+        <w:t>–</w:t>
+      </w:r>
+      <w:r>
+        <w:t xml:space="preserve"> </w:t>
+      </w:r>
+      <w:r>
+        <w:t>Present</w:t>
       </w:r>
     </w:p>
     <w:p>
       <w:pPr>
-        <w:pStyle w:val="a"/>
-      </w:pPr>
-      <w:r>
-        <w:t>[Content Placeholder]</w:t>
+        <w:pStyle w:val="ListBullet"/>
+      </w:pPr>
+      <w:r>
+        <w:t>Recruit, hire, train, and coach over 30 staff members on customer service skills, food &amp; beverage knowledge, sales, and health &amp; safety standards.</w:t>
       </w:r>
     </w:p>
     <w:p>
       <w:pPr>
-        <w:pStyle w:val="a"/>
-      </w:pPr>
-      <w:r>
-        <w:t>[Content Placeholder]</w:t>
+        <w:pStyle w:val="ListBullet"/>
+      </w:pPr>
+      <w:r>
+        <w:t xml:space="preserve">Reduced costs by 7% through controls on overtime, operational efficiencies, and reduced waste. </w:t>
       </w:r>
     </w:p>
     <w:p>
       <w:pPr>
-        <w:pStyle w:val="a"/>
-      </w:pPr>
-      <w:r>
-        <w:t>[Content Placeholder]</w:t>
+        <w:pStyle w:val="ListBullet"/>
+      </w:pPr>
+      <w:r>
+        <w:t>Consistently exceed monthly sales goals by a minimum of 10% by training FOH staff on upselling techniques and by creating a featured food and beverage program.</w:t>
       </w:r>
     </w:p>
     <w:p>
       <w:pPr>
-        <w:pStyle w:val="2"/>
-      </w:pPr>
-      <w:r>
-        <w:t>[Job Title] | [Company Name] | [Dates]</w:t>
-      </w:r>
-      <w:r>
-        <w:br/>
-        <w:t>- [Responsibility or achievement #1]</w:t>
-      </w:r>
-      <w:r>
-        <w:br/>
-        <w:t>- [Responsibility or achievement #2]</w:t>
+        <w:pStyle w:val="Heading2"/>
+      </w:pPr>
+      <w:r>
+        <w:t xml:space="preserve">Restaurant Manager </w:t>
+      </w:r>
+      <w:r>
+        <w:t xml:space="preserve">| </w:t>
+      </w:r>
+      <w:r>
+        <w:t xml:space="preserve">Fourth Coffee Bistro </w:t>
+      </w:r>
+      <w:r>
+        <w:t xml:space="preserve">| </w:t>
+      </w:r>
+      <w:r>
+        <w:t xml:space="preserve">June </w:t>
+      </w:r>
+      <w:r>
+        <w:t>20</w:t>
+      </w:r>
+      <w:r>
+        <w:t>XX</w:t>
+      </w:r>
+      <w:r>
+        <w:t xml:space="preserve"> </w:t>
+      </w:r>
+      <w:r>
+        <w:t>–</w:t>
+      </w:r>
+      <w:r>
+        <w:t xml:space="preserve"> </w:t>
+      </w:r>
+      <w:r>
+        <w:t xml:space="preserve">August </w:t>
+      </w:r>
+      <w:r>
+        <w:t>20</w:t>
+      </w:r>
+      <w:r>
+        <w:t>XX</w:t>
       </w:r>
     </w:p>
     <w:p>
       <w:pPr>
-        <w:pStyle w:val="a"/>
-      </w:pPr>
-      <w:r>
-        <w:t>[Content Placeholder]</w:t>
+        <w:pStyle w:val="ListBullet"/>
+      </w:pPr>
+      <w:r>
+        <w:t xml:space="preserve">Created a cross-training program ensuring FOH staff members were able to perform confidently and effectively in all positions. </w:t>
       </w:r>
     </w:p>
     <w:p>
       <w:pPr>
-        <w:pStyle w:val="a"/>
-      </w:pPr>
-      <w:r>
-        <w:t>[Content Placeholder]</w:t>
+        <w:pStyle w:val="ListBullet"/>
+      </w:pPr>
+      <w:r>
+        <w:t xml:space="preserve">Grew customer based and increased restaurant social media accounts by 19% through interactive promotions, engaging </w:t>
+      </w:r>
+      <w:r>
+        <w:t>postings,</w:t>
+      </w:r>
+      <w:r>
+        <w:t xml:space="preserve"> and contests. </w:t>
       </w:r>
     </w:p>
     <w:p>
       <w:pPr>
-        <w:pStyle w:val="a"/>
-      </w:pPr>
-      <w:r>
-        <w:t>[Content Placeholder]</w:t>
+        <w:pStyle w:val="ListBullet"/>
+      </w:pPr>
+      <w:r>
+        <w:t xml:space="preserve">Created and implemented staff health and safety standards compliance training program, achieving a score of 99% from the Board of Health. </w:t>
       </w:r>
     </w:p>
     <w:p>
       <w:pPr>
-        <w:pStyle w:val="a"/>
-      </w:pPr>
-      <w:r>
-        <w:t>[Content Placeholder]</w:t>
+        <w:pStyle w:val="ListBullet"/>
+      </w:pPr>
+      <w:r>
+        <w:t>Successfully redesigned existing inventory system, ordering and food storage practices, resulting in a 6% decrease in food waste and higher net profits.</w:t>
       </w:r>
     </w:p>
     <w:p>
       <w:pPr>
-        <w:pStyle w:val="1"/>
+        <w:pStyle w:val="Heading1"/>
       </w:pPr>
       <w:r>
         <w:t>Education</w:t>
@@ -161,64 +228,203 @@
     </w:p>
     <w:p>
       <w:pPr>
-        <w:pStyle w:val="2"/>
-      </w:pPr>
-      <w:r>
-        <w:t>[Degree] | [Date] | [Institution]</w:t>
+        <w:pStyle w:val="Heading2"/>
+      </w:pPr>
+      <w:r>
+        <w:t>B</w:t>
+      </w:r>
+      <w:r>
+        <w:t>.S.</w:t>
+      </w:r>
+      <w:r>
+        <w:t xml:space="preserve"> </w:t>
+      </w:r>
+      <w:r>
+        <w:t xml:space="preserve">in </w:t>
+      </w:r>
+      <w:r>
+        <w:t xml:space="preserve">Business Administration </w:t>
+      </w:r>
+      <w:r>
+        <w:t xml:space="preserve">| </w:t>
+      </w:r>
+      <w:r>
+        <w:t xml:space="preserve">June </w:t>
+      </w:r>
+      <w:r>
+        <w:t>20</w:t>
+      </w:r>
+      <w:r>
+        <w:t>XX</w:t>
+      </w:r>
+      <w:r>
+        <w:t xml:space="preserve"> | </w:t>
+      </w:r>
+      <w:r>
+        <w:t>Bigtown College</w:t>
+      </w:r>
+      <w:r>
+        <w:t xml:space="preserve">, </w:t>
+      </w:r>
+      <w:r>
+        <w:t>Chicago</w:t>
+      </w:r>
+      <w:r>
+        <w:t xml:space="preserve">, </w:t>
+      </w:r>
+      <w:r>
+        <w:t>Illinois</w:t>
       </w:r>
     </w:p>
     <w:p>
       <w:pPr>
-        <w:pStyle w:val="2"/>
+        <w:pStyle w:val="Heading2"/>
       </w:pPr>
     </w:p>
     <w:p>
       <w:pPr>
-        <w:pStyle w:val="2"/>
-      </w:pPr>
-      <w:r>
-        <w:t>[Degree] | [Date] | [Institution]</w:t>
+        <w:pStyle w:val="Heading2"/>
+      </w:pPr>
+      <w:r>
+        <w:t>A</w:t>
+      </w:r>
+      <w:r>
+        <w:t>.A.</w:t>
+      </w:r>
+      <w:r>
+        <w:t xml:space="preserve"> </w:t>
+      </w:r>
+      <w:r>
+        <w:t xml:space="preserve">in </w:t>
+      </w:r>
+      <w:r>
+        <w:t xml:space="preserve">Hospitality Management </w:t>
+      </w:r>
+      <w:r>
+        <w:t xml:space="preserve">| </w:t>
+      </w:r>
+      <w:r>
+        <w:t xml:space="preserve">June </w:t>
+      </w:r>
+      <w:r>
+        <w:t>20</w:t>
+      </w:r>
+      <w:r>
+        <w:t>XX</w:t>
+      </w:r>
+      <w:r>
+        <w:t xml:space="preserve"> | </w:t>
+      </w:r>
+      <w:r>
+        <w:t>Bigtown College</w:t>
+      </w:r>
+      <w:r>
+        <w:t xml:space="preserve">, </w:t>
+      </w:r>
+      <w:r>
+        <w:t>Chicago</w:t>
+      </w:r>
+      <w:r>
+        <w:t xml:space="preserve">, </w:t>
+      </w:r>
+      <w:r>
+        <w:t>Illinois</w:t>
       </w:r>
     </w:p>
     <w:p>
       <w:pPr>
-        <w:pStyle w:val="1"/>
-      </w:pPr>
-      <w:r>
-        <w:t>Skills</w:t>
-      </w:r>
-      <w:r>
-        <w:br/>
-        <w:t>[Skill #1]</w:t>
-      </w:r>
-      <w:r>
-        <w:br/>
-        <w:t>[Skill #2]</w:t>
-      </w:r>
-      <w:r>
-        <w:br/>
-        <w:t>[Skill #3]</w:t>
+        <w:pStyle w:val="Heading1"/>
+      </w:pPr>
+      <w:r>
+        <w:t>Skills &amp; Abilities</w:t>
+      </w:r>
+    </w:p>
+    <w:tbl>
+      <w:tblPr>
+        <w:tblW w:w="5000" w:type="pct"/>
+        <w:tblCellMar>
+          <w:left w:w="0" w:type="dxa"/>
+          <w:right w:w="0" w:type="dxa"/>
+        </w:tblCellMar>
+        <w:tblLook w:val="0600" w:firstRow="0" w:lastRow="0" w:firstColumn="0" w:lastColumn="0" w:noHBand="1" w:noVBand="1"/>
+        <w:tblCaption w:val="Layout table"/>
+      </w:tblPr>
+      <w:tblGrid>
+        <w:gridCol w:w="5310"/>
+        <w:gridCol w:w="4626"/>
+      </w:tblGrid>
+      <w:tr>
+        <w:tc>
+          <w:tcPr>
+            <w:tcW w:w="5310" w:type="dxa"/>
+          </w:tcPr>
+          <w:p>
+            <w:pPr>
+              <w:pStyle w:val="ListBullet"/>
+            </w:pPr>
+            <w:r>
+              <w:t>Accounting &amp; Budgeting</w:t>
+            </w:r>
+          </w:p>
+          <w:p>
+            <w:pPr>
+              <w:pStyle w:val="ListBullet"/>
+            </w:pPr>
+            <w:r>
+              <w:t>Proficient with POS systems</w:t>
+            </w:r>
+          </w:p>
+          <w:p>
+            <w:pPr>
+              <w:pStyle w:val="ListBullet"/>
+            </w:pPr>
+            <w:r>
+              <w:t>Excellent interpersonal and communication skills</w:t>
+            </w:r>
+          </w:p>
+        </w:tc>
+        <w:tc>
+          <w:tcPr>
+            <w:tcW w:w="4626" w:type="dxa"/>
+          </w:tcPr>
+          <w:p>
+            <w:pPr>
+              <w:pStyle w:val="ListBullet"/>
+            </w:pPr>
+            <w:r>
+              <w:t>Poised under pressure</w:t>
+            </w:r>
+          </w:p>
+          <w:p>
+            <w:pPr>
+              <w:pStyle w:val="ListBullet"/>
+            </w:pPr>
+            <w:r>
+              <w:t>Experienced in most restaurant positions</w:t>
+            </w:r>
+          </w:p>
+          <w:p>
+            <w:pPr>
+              <w:pStyle w:val="ListBullet"/>
+            </w:pPr>
+            <w:r>
+              <w:t>Fun and energetic</w:t>
+            </w:r>
+          </w:p>
+        </w:tc>
+      </w:tr>
+    </w:tbl>
+    <w:p>
+      <w:pPr>
+        <w:pStyle w:val="Heading1"/>
+      </w:pPr>
+      <w:r>
+        <w:t>Activities and Interests</w:t>
       </w:r>
     </w:p>
     <w:p>
-      <w:pPr>
-        <w:pStyle w:val="1"/>
-      </w:pPr>
-      <w:r>
-        <w:t>Activities &amp; Interests</w:t>
-      </w:r>
-      <w:r>
-        <w:br/>
-        <w:t>[Activity #1]</w:t>
-      </w:r>
-      <w:r>
-        <w:br/>
-        <w:t>[Activity #2]</w:t>
-      </w:r>
-    </w:p>
-    <w:p>
-      <w:r>
-        <w:t>[Content Placeholder]</w:t>
+      <w:r>
+        <w:t>Theater, environmental conservation, art, hiking, skiing, travel</w:t>
       </w:r>
     </w:p>
     <w:sectPr>
@@ -236,7 +442,7 @@
 </file>
 
 <file path=word/endnotes.xml><?xml version="1.0" encoding="utf-8"?>
-<w:endnotes xmlns:wpc="http://schemas.microsoft.com/office/word/2010/wordprocessingCanvas" xmlns:cx="http://schemas.microsoft.com/office/drawing/2014/chartex" xmlns:cx1="http://schemas.microsoft.com/office/drawing/2015/9/8/chartex" xmlns:cx2="http://schemas.microsoft.com/office/drawing/2015/10/21/chartex" xmlns:cx3="http://schemas.microsoft.com/office/drawing/2016/5/9/chartex" xmlns:cx4="http://schemas.microsoft.com/office/drawing/2016/5/10/chartex" xmlns:cx5="http://schemas.microsoft.com/office/drawing/2016/5/11/chartex" xmlns:cx6="http://schemas.microsoft.com/office/drawing/2016/5/12/chartex" xmlns:cx7="http://schemas.microsoft.com/office/drawing/2016/5/13/chartex" xmlns:cx8="http://schemas.microsoft.com/office/drawing/2016/5/14/chartex" xmlns:mc="http://schemas.openxmlformats.org/markup-compatibility/2006" xmlns:aink="http://schemas.microsoft.com/office/drawing/2016/ink" xmlns:am3d="http://schemas.microsoft.com/office/drawing/2017/model3d" xmlns:o="urn:schemas-microsoft-com:office:office" xmlns:oel="http://schemas.microsoft.com/office/2019/extlst" xmlns:r="http://schemas.openxmlformats.org/officeDocument/2006/relationships" xmlns:m="http://schemas.openxmlformats.org/officeDocument/2006/math" xmlns:v="urn:schemas-microsoft-com:vml" xmlns:wp14="http://schemas.microsoft.com/office/word/2010/wordprocessingDrawing" xmlns:wp="http://schemas.openxmlformats.org/drawingml/2006/wordprocessingDrawing" xmlns:w10="urn:schemas-microsoft-com:office:word" xmlns:w="http://schemas.openxmlformats.org/wordprocessingml/2006/main" xmlns:w14="http://schemas.microsoft.com/office/word/2010/wordml" xmlns:w15="http://schemas.microsoft.com/office/word/2012/wordml" xmlns:w16cex="http://schemas.microsoft.com/office/word/2018/wordml/cex" xmlns:w16cid="http://schemas.microsoft.com/office/word/2016/wordml/cid" xmlns:w16="http://schemas.microsoft.com/office/word/2018/wordml" xmlns:w16du="http://schemas.microsoft.com/office/word/2023/wordml/word16du" xmlns:w16sdtdh="http://schemas.microsoft.com/office/word/2020/wordml/sdtdatahash" xmlns:w16sdtfl="http://schemas.microsoft.com/office/word/2024/wordml/sdtformatlock" xmlns:w16se="http://schemas.microsoft.com/office/word/2015/wordml/symex" xmlns:wpg="http://schemas.microsoft.com/office/word/2010/wordprocessingGroup" xmlns:wpi="http://schemas.microsoft.com/office/word/2010/wordprocessingInk" xmlns:wne="http://schemas.microsoft.com/office/word/2006/wordml" xmlns:wps="http://schemas.microsoft.com/office/word/2010/wordprocessingShape" mc:Ignorable="w14 w15 w16se w16cid w16 w16cex w16sdtdh w16sdtfl w16du wp14">
+<w:endnotes xmlns:wpc="http://schemas.microsoft.com/office/word/2010/wordprocessingCanvas" xmlns:cx="http://schemas.microsoft.com/office/drawing/2014/chartex" xmlns:cx1="http://schemas.microsoft.com/office/drawing/2015/9/8/chartex" xmlns:cx2="http://schemas.microsoft.com/office/drawing/2015/10/21/chartex" xmlns:cx3="http://schemas.microsoft.com/office/drawing/2016/5/9/chartex" xmlns:cx4="http://schemas.microsoft.com/office/drawing/2016/5/10/chartex" xmlns:cx5="http://schemas.microsoft.com/office/drawing/2016/5/11/chartex" xmlns:cx6="http://schemas.microsoft.com/office/drawing/2016/5/12/chartex" xmlns:cx7="http://schemas.microsoft.com/office/drawing/2016/5/13/chartex" xmlns:cx8="http://schemas.microsoft.com/office/drawing/2016/5/14/chartex" xmlns:mc="http://schemas.openxmlformats.org/markup-compatibility/2006" xmlns:aink="http://schemas.microsoft.com/office/drawing/2016/ink" xmlns:am3d="http://schemas.microsoft.com/office/drawing/2017/model3d" xmlns:o="urn:schemas-microsoft-com:office:office" xmlns:oel="http://schemas.microsoft.com/office/2019/extlst" xmlns:r="http://schemas.openxmlformats.org/officeDocument/2006/relationships" xmlns:m="http://schemas.openxmlformats.org/officeDocument/2006/math" xmlns:v="urn:schemas-microsoft-com:vml" xmlns:wp14="http://schemas.microsoft.com/office/word/2010/wordprocessingDrawing" xmlns:wp="http://schemas.openxmlformats.org/drawingml/2006/wordprocessingDrawing" xmlns:w10="urn:schemas-microsoft-com:office:word" xmlns:w="http://schemas.openxmlformats.org/wordprocessingml/2006/main" xmlns:w14="http://schemas.microsoft.com/office/word/2010/wordml" xmlns:w15="http://schemas.microsoft.com/office/word/2012/wordml" xmlns:w16cex="http://schemas.microsoft.com/office/word/2018/wordml/cex" xmlns:w16cid="http://schemas.microsoft.com/office/word/2016/wordml/cid" xmlns:w16="http://schemas.microsoft.com/office/word/2018/wordml" xmlns:w16du="http://schemas.microsoft.com/office/word/2023/wordml/word16du" xmlns:w16sdtdh="http://schemas.microsoft.com/office/word/2020/wordml/sdtdatahash" xmlns:w16se="http://schemas.microsoft.com/office/word/2015/wordml/symex" xmlns:wpg="http://schemas.microsoft.com/office/word/2010/wordprocessingGroup" xmlns:wpi="http://schemas.microsoft.com/office/word/2010/wordprocessingInk" xmlns:wne="http://schemas.microsoft.com/office/word/2006/wordml" xmlns:wps="http://schemas.microsoft.com/office/word/2010/wordprocessingShape" mc:Ignorable="w14 w15 w16se w16cid w16 w16cex w16sdtdh w16du wp14">
   <w:endnote w:type="separator" w:id="-1">
     <w:p>
       <w:pPr>
@@ -260,11 +466,11 @@
 </w:endnotes>
 </file>
 
-<file path=word/footer1.xml><?xml version="1.0" encoding="utf-8"?>
-<w:ftr xmlns:wpc="http://schemas.microsoft.com/office/word/2010/wordprocessingCanvas" xmlns:cx="http://schemas.microsoft.com/office/drawing/2014/chartex" xmlns:cx1="http://schemas.microsoft.com/office/drawing/2015/9/8/chartex" xmlns:cx2="http://schemas.microsoft.com/office/drawing/2015/10/21/chartex" xmlns:cx3="http://schemas.microsoft.com/office/drawing/2016/5/9/chartex" xmlns:cx4="http://schemas.microsoft.com/office/drawing/2016/5/10/chartex" xmlns:cx5="http://schemas.microsoft.com/office/drawing/2016/5/11/chartex" xmlns:cx6="http://schemas.microsoft.com/office/drawing/2016/5/12/chartex" xmlns:cx7="http://schemas.microsoft.com/office/drawing/2016/5/13/chartex" xmlns:cx8="http://schemas.microsoft.com/office/drawing/2016/5/14/chartex" xmlns:mc="http://schemas.openxmlformats.org/markup-compatibility/2006" xmlns:aink="http://schemas.microsoft.com/office/drawing/2016/ink" xmlns:am3d="http://schemas.microsoft.com/office/drawing/2017/model3d" xmlns:o="urn:schemas-microsoft-com:office:office" xmlns:oel="http://schemas.microsoft.com/office/2019/extlst" xmlns:r="http://schemas.openxmlformats.org/officeDocument/2006/relationships" xmlns:m="http://schemas.openxmlformats.org/officeDocument/2006/math" xmlns:v="urn:schemas-microsoft-com:vml" xmlns:wp14="http://schemas.microsoft.com/office/word/2010/wordprocessingDrawing" xmlns:wp="http://schemas.openxmlformats.org/drawingml/2006/wordprocessingDrawing" xmlns:w10="urn:schemas-microsoft-com:office:word" xmlns:w="http://schemas.openxmlformats.org/wordprocessingml/2006/main" xmlns:w14="http://schemas.microsoft.com/office/word/2010/wordml" xmlns:w15="http://schemas.microsoft.com/office/word/2012/wordml" xmlns:w16cex="http://schemas.microsoft.com/office/word/2018/wordml/cex" xmlns:w16cid="http://schemas.microsoft.com/office/word/2016/wordml/cid" xmlns:w16="http://schemas.microsoft.com/office/word/2018/wordml" xmlns:w16du="http://schemas.microsoft.com/office/word/2023/wordml/word16du" xmlns:w16sdtdh="http://schemas.microsoft.com/office/word/2020/wordml/sdtdatahash" xmlns:w16sdtfl="http://schemas.microsoft.com/office/word/2024/wordml/sdtformatlock" xmlns:w16se="http://schemas.microsoft.com/office/word/2015/wordml/symex" xmlns:wpg="http://schemas.microsoft.com/office/word/2010/wordprocessingGroup" xmlns:wpi="http://schemas.microsoft.com/office/word/2010/wordprocessingInk" xmlns:wne="http://schemas.microsoft.com/office/word/2006/wordml" xmlns:wps="http://schemas.microsoft.com/office/word/2010/wordprocessingShape" mc:Ignorable="w14 w15 w16se w16cid w16 w16cex w16sdtdh w16sdtfl w16du wp14">
+<file path=word/footer11.xml><?xml version="1.0" encoding="utf-8"?>
+<w:ftr xmlns:wpc="http://schemas.microsoft.com/office/word/2010/wordprocessingCanvas" xmlns:cx="http://schemas.microsoft.com/office/drawing/2014/chartex" xmlns:cx1="http://schemas.microsoft.com/office/drawing/2015/9/8/chartex" xmlns:cx2="http://schemas.microsoft.com/office/drawing/2015/10/21/chartex" xmlns:cx3="http://schemas.microsoft.com/office/drawing/2016/5/9/chartex" xmlns:cx4="http://schemas.microsoft.com/office/drawing/2016/5/10/chartex" xmlns:cx5="http://schemas.microsoft.com/office/drawing/2016/5/11/chartex" xmlns:cx6="http://schemas.microsoft.com/office/drawing/2016/5/12/chartex" xmlns:cx7="http://schemas.microsoft.com/office/drawing/2016/5/13/chartex" xmlns:cx8="http://schemas.microsoft.com/office/drawing/2016/5/14/chartex" xmlns:mc="http://schemas.openxmlformats.org/markup-compatibility/2006" xmlns:aink="http://schemas.microsoft.com/office/drawing/2016/ink" xmlns:am3d="http://schemas.microsoft.com/office/drawing/2017/model3d" xmlns:o="urn:schemas-microsoft-com:office:office" xmlns:oel="http://schemas.microsoft.com/office/2019/extlst" xmlns:r="http://schemas.openxmlformats.org/officeDocument/2006/relationships" xmlns:m="http://schemas.openxmlformats.org/officeDocument/2006/math" xmlns:v="urn:schemas-microsoft-com:vml" xmlns:wp14="http://schemas.microsoft.com/office/word/2010/wordprocessingDrawing" xmlns:wp="http://schemas.openxmlformats.org/drawingml/2006/wordprocessingDrawing" xmlns:w10="urn:schemas-microsoft-com:office:word" xmlns:w="http://schemas.openxmlformats.org/wordprocessingml/2006/main" xmlns:w14="http://schemas.microsoft.com/office/word/2010/wordml" xmlns:w15="http://schemas.microsoft.com/office/word/2012/wordml" xmlns:w16cex="http://schemas.microsoft.com/office/word/2018/wordml/cex" xmlns:w16cid="http://schemas.microsoft.com/office/word/2016/wordml/cid" xmlns:w16="http://schemas.microsoft.com/office/word/2018/wordml" xmlns:w16du="http://schemas.microsoft.com/office/word/2023/wordml/word16du" xmlns:w16sdtdh="http://schemas.microsoft.com/office/word/2020/wordml/sdtdatahash" xmlns:w16se="http://schemas.microsoft.com/office/word/2015/wordml/symex" xmlns:wpg="http://schemas.microsoft.com/office/word/2010/wordprocessingGroup" xmlns:wpi="http://schemas.microsoft.com/office/word/2010/wordprocessingInk" xmlns:wne="http://schemas.microsoft.com/office/word/2006/wordml" xmlns:wps="http://schemas.microsoft.com/office/word/2010/wordprocessingShape" mc:Ignorable="w14 w15 w16se w16cid w16 w16cex w16sdtdh w16du wp14">
   <w:p>
     <w:pPr>
-      <w:pStyle w:val="aa"/>
+      <w:pStyle w:val="Footer"/>
     </w:pPr>
     <w:r>
       <w:t xml:space="preserve">Page </w:t>
@@ -295,7 +501,7 @@
 </file>
 
 <file path=word/footnotes.xml><?xml version="1.0" encoding="utf-8"?>
-<w:footnotes xmlns:wpc="http://schemas.microsoft.com/office/word/2010/wordprocessingCanvas" xmlns:cx="http://schemas.microsoft.com/office/drawing/2014/chartex" xmlns:cx1="http://schemas.microsoft.com/office/drawing/2015/9/8/chartex" xmlns:cx2="http://schemas.microsoft.com/office/drawing/2015/10/21/chartex" xmlns:cx3="http://schemas.microsoft.com/office/drawing/2016/5/9/chartex" xmlns:cx4="http://schemas.microsoft.com/office/drawing/2016/5/10/chartex" xmlns:cx5="http://schemas.microsoft.com/office/drawing/2016/5/11/chartex" xmlns:cx6="http://schemas.microsoft.com/office/drawing/2016/5/12/chartex" xmlns:cx7="http://schemas.microsoft.com/office/drawing/2016/5/13/chartex" xmlns:cx8="http://schemas.microsoft.com/office/drawing/2016/5/14/chartex" xmlns:mc="http://schemas.openxmlformats.org/markup-compatibility/2006" xmlns:aink="http://schemas.microsoft.com/office/drawing/2016/ink" xmlns:am3d="http://schemas.microsoft.com/office/drawing/2017/model3d" xmlns:o="urn:schemas-microsoft-com:office:office" xmlns:oel="http://schemas.microsoft.com/office/2019/extlst" xmlns:r="http://schemas.openxmlformats.org/officeDocument/2006/relationships" xmlns:m="http://schemas.openxmlformats.org/officeDocument/2006/math" xmlns:v="urn:schemas-microsoft-com:vml" xmlns:wp14="http://schemas.microsoft.com/office/word/2010/wordprocessingDrawing" xmlns:wp="http://schemas.openxmlformats.org/drawingml/2006/wordprocessingDrawing" xmlns:w10="urn:schemas-microsoft-com:office:word" xmlns:w="http://schemas.openxmlformats.org/wordprocessingml/2006/main" xmlns:w14="http://schemas.microsoft.com/office/word/2010/wordml" xmlns:w15="http://schemas.microsoft.com/office/word/2012/wordml" xmlns:w16cex="http://schemas.microsoft.com/office/word/2018/wordml/cex" xmlns:w16cid="http://schemas.microsoft.com/office/word/2016/wordml/cid" xmlns:w16="http://schemas.microsoft.com/office/word/2018/wordml" xmlns:w16du="http://schemas.microsoft.com/office/word/2023/wordml/word16du" xmlns:w16sdtdh="http://schemas.microsoft.com/office/word/2020/wordml/sdtdatahash" xmlns:w16sdtfl="http://schemas.microsoft.com/office/word/2024/wordml/sdtformatlock" xmlns:w16se="http://schemas.microsoft.com/office/word/2015/wordml/symex" xmlns:wpg="http://schemas.microsoft.com/office/word/2010/wordprocessingGroup" xmlns:wpi="http://schemas.microsoft.com/office/word/2010/wordprocessingInk" xmlns:wne="http://schemas.microsoft.com/office/word/2006/wordml" xmlns:wps="http://schemas.microsoft.com/office/word/2010/wordprocessingShape" mc:Ignorable="w14 w15 w16se w16cid w16 w16cex w16sdtdh w16sdtfl w16du wp14">
+<w:footnotes xmlns:wpc="http://schemas.microsoft.com/office/word/2010/wordprocessingCanvas" xmlns:cx="http://schemas.microsoft.com/office/drawing/2014/chartex" xmlns:cx1="http://schemas.microsoft.com/office/drawing/2015/9/8/chartex" xmlns:cx2="http://schemas.microsoft.com/office/drawing/2015/10/21/chartex" xmlns:cx3="http://schemas.microsoft.com/office/drawing/2016/5/9/chartex" xmlns:cx4="http://schemas.microsoft.com/office/drawing/2016/5/10/chartex" xmlns:cx5="http://schemas.microsoft.com/office/drawing/2016/5/11/chartex" xmlns:cx6="http://schemas.microsoft.com/office/drawing/2016/5/12/chartex" xmlns:cx7="http://schemas.microsoft.com/office/drawing/2016/5/13/chartex" xmlns:cx8="http://schemas.microsoft.com/office/drawing/2016/5/14/chartex" xmlns:mc="http://schemas.openxmlformats.org/markup-compatibility/2006" xmlns:aink="http://schemas.microsoft.com/office/drawing/2016/ink" xmlns:am3d="http://schemas.microsoft.com/office/drawing/2017/model3d" xmlns:o="urn:schemas-microsoft-com:office:office" xmlns:oel="http://schemas.microsoft.com/office/2019/extlst" xmlns:r="http://schemas.openxmlformats.org/officeDocument/2006/relationships" xmlns:m="http://schemas.openxmlformats.org/officeDocument/2006/math" xmlns:v="urn:schemas-microsoft-com:vml" xmlns:wp14="http://schemas.microsoft.com/office/word/2010/wordprocessingDrawing" xmlns:wp="http://schemas.openxmlformats.org/drawingml/2006/wordprocessingDrawing" xmlns:w10="urn:schemas-microsoft-com:office:word" xmlns:w="http://schemas.openxmlformats.org/wordprocessingml/2006/main" xmlns:w14="http://schemas.microsoft.com/office/word/2010/wordml" xmlns:w15="http://schemas.microsoft.com/office/word/2012/wordml" xmlns:w16cex="http://schemas.microsoft.com/office/word/2018/wordml/cex" xmlns:w16cid="http://schemas.microsoft.com/office/word/2016/wordml/cid" xmlns:w16="http://schemas.microsoft.com/office/word/2018/wordml" xmlns:w16du="http://schemas.microsoft.com/office/word/2023/wordml/word16du" xmlns:w16sdtdh="http://schemas.microsoft.com/office/word/2020/wordml/sdtdatahash" xmlns:w16se="http://schemas.microsoft.com/office/word/2015/wordml/symex" xmlns:wpg="http://schemas.microsoft.com/office/word/2010/wordprocessingGroup" xmlns:wpi="http://schemas.microsoft.com/office/word/2010/wordprocessingInk" xmlns:wne="http://schemas.microsoft.com/office/word/2006/wordml" xmlns:wps="http://schemas.microsoft.com/office/word/2010/wordprocessingShape" mc:Ignorable="w14 w15 w16se w16cid w16 w16cex w16sdtdh w16du wp14">
   <w:footnote w:type="separator" w:id="-1">
     <w:p>
       <w:pPr>
@@ -320,7 +526,7 @@
 </file>
 
 <file path=word/numbering.xml><?xml version="1.0" encoding="utf-8"?>
-<w:numbering xmlns:wpc="http://schemas.microsoft.com/office/word/2010/wordprocessingCanvas" xmlns:cx="http://schemas.microsoft.com/office/drawing/2014/chartex" xmlns:cx1="http://schemas.microsoft.com/office/drawing/2015/9/8/chartex" xmlns:cx2="http://schemas.microsoft.com/office/drawing/2015/10/21/chartex" xmlns:cx3="http://schemas.microsoft.com/office/drawing/2016/5/9/chartex" xmlns:cx4="http://schemas.microsoft.com/office/drawing/2016/5/10/chartex" xmlns:cx5="http://schemas.microsoft.com/office/drawing/2016/5/11/chartex" xmlns:cx6="http://schemas.microsoft.com/office/drawing/2016/5/12/chartex" xmlns:cx7="http://schemas.microsoft.com/office/drawing/2016/5/13/chartex" xmlns:cx8="http://schemas.microsoft.com/office/drawing/2016/5/14/chartex" xmlns:mc="http://schemas.openxmlformats.org/markup-compatibility/2006" xmlns:aink="http://schemas.microsoft.com/office/drawing/2016/ink" xmlns:am3d="http://schemas.microsoft.com/office/drawing/2017/model3d" xmlns:o="urn:schemas-microsoft-com:office:office" xmlns:oel="http://schemas.microsoft.com/office/2019/extlst" xmlns:r="http://schemas.openxmlformats.org/officeDocument/2006/relationships" xmlns:m="http://schemas.openxmlformats.org/officeDocument/2006/math" xmlns:v="urn:schemas-microsoft-com:vml" xmlns:wp14="http://schemas.microsoft.com/office/word/2010/wordprocessingDrawing" xmlns:wp="http://schemas.openxmlformats.org/drawingml/2006/wordprocessingDrawing" xmlns:w10="urn:schemas-microsoft-com:office:word" xmlns:w="http://schemas.openxmlformats.org/wordprocessingml/2006/main" xmlns:w14="http://schemas.microsoft.com/office/word/2010/wordml" xmlns:w15="http://schemas.microsoft.com/office/word/2012/wordml" xmlns:w16cex="http://schemas.microsoft.com/office/word/2018/wordml/cex" xmlns:w16cid="http://schemas.microsoft.com/office/word/2016/wordml/cid" xmlns:w16="http://schemas.microsoft.com/office/word/2018/wordml" xmlns:w16du="http://schemas.microsoft.com/office/word/2023/wordml/word16du" xmlns:w16sdtdh="http://schemas.microsoft.com/office/word/2020/wordml/sdtdatahash" xmlns:w16sdtfl="http://schemas.microsoft.com/office/word/2024/wordml/sdtformatlock" xmlns:w16se="http://schemas.microsoft.com/office/word/2015/wordml/symex" xmlns:wpg="http://schemas.microsoft.com/office/word/2010/wordprocessingGroup" xmlns:wpi="http://schemas.microsoft.com/office/word/2010/wordprocessingInk" xmlns:wne="http://schemas.microsoft.com/office/word/2006/wordml" xmlns:wps="http://schemas.microsoft.com/office/word/2010/wordprocessingShape" mc:Ignorable="w14 w15 w16se w16cid w16 w16cex w16sdtdh w16sdtfl w16du wp14">
+<w:numbering xmlns:wpc="http://schemas.microsoft.com/office/word/2010/wordprocessingCanvas" xmlns:cx="http://schemas.microsoft.com/office/drawing/2014/chartex" xmlns:cx1="http://schemas.microsoft.com/office/drawing/2015/9/8/chartex" xmlns:cx2="http://schemas.microsoft.com/office/drawing/2015/10/21/chartex" xmlns:cx3="http://schemas.microsoft.com/office/drawing/2016/5/9/chartex" xmlns:cx4="http://schemas.microsoft.com/office/drawing/2016/5/10/chartex" xmlns:cx5="http://schemas.microsoft.com/office/drawing/2016/5/11/chartex" xmlns:cx6="http://schemas.microsoft.com/office/drawing/2016/5/12/chartex" xmlns:cx7="http://schemas.microsoft.com/office/drawing/2016/5/13/chartex" xmlns:cx8="http://schemas.microsoft.com/office/drawing/2016/5/14/chartex" xmlns:mc="http://schemas.openxmlformats.org/markup-compatibility/2006" xmlns:aink="http://schemas.microsoft.com/office/drawing/2016/ink" xmlns:am3d="http://schemas.microsoft.com/office/drawing/2017/model3d" xmlns:o="urn:schemas-microsoft-com:office:office" xmlns:oel="http://schemas.microsoft.com/office/2019/extlst" xmlns:r="http://schemas.openxmlformats.org/officeDocument/2006/relationships" xmlns:m="http://schemas.openxmlformats.org/officeDocument/2006/math" xmlns:v="urn:schemas-microsoft-com:vml" xmlns:wp14="http://schemas.microsoft.com/office/word/2010/wordprocessingDrawing" xmlns:wp="http://schemas.openxmlformats.org/drawingml/2006/wordprocessingDrawing" xmlns:w10="urn:schemas-microsoft-com:office:word" xmlns:w="http://schemas.openxmlformats.org/wordprocessingml/2006/main" xmlns:w14="http://schemas.microsoft.com/office/word/2010/wordml" xmlns:w15="http://schemas.microsoft.com/office/word/2012/wordml" xmlns:w16cex="http://schemas.microsoft.com/office/word/2018/wordml/cex" xmlns:w16cid="http://schemas.microsoft.com/office/word/2016/wordml/cid" xmlns:w16="http://schemas.microsoft.com/office/word/2018/wordml" xmlns:w16du="http://schemas.microsoft.com/office/word/2023/wordml/word16du" xmlns:w16sdtdh="http://schemas.microsoft.com/office/word/2020/wordml/sdtdatahash" xmlns:w16se="http://schemas.microsoft.com/office/word/2015/wordml/symex" xmlns:wpg="http://schemas.microsoft.com/office/word/2010/wordprocessingGroup" xmlns:wpi="http://schemas.microsoft.com/office/word/2010/wordprocessingInk" xmlns:wne="http://schemas.microsoft.com/office/word/2006/wordml" xmlns:wps="http://schemas.microsoft.com/office/word/2010/wordprocessingShape" mc:Ignorable="w14 w15 w16se w16cid w16 w16cex w16sdtdh w16du wp14">
   <w:abstractNum w:abstractNumId="0" w15:restartNumberingAfterBreak="0">
     <w:nsid w:val="FFFFFF7C"/>
     <w:multiLevelType w:val="singleLevel"/>
@@ -599,7 +805,7 @@
     <w:lvl w:ilvl="0">
       <w:start w:val="1"/>
       <w:numFmt w:val="bullet"/>
-      <w:pStyle w:val="a"/>
+      <w:pStyle w:val="ListBullet"/>
       <w:lvlText w:val="·"/>
       <w:lvlJc w:val="left"/>
       <w:pPr>
@@ -1713,7 +1919,7 @@
     <w:lvl w:ilvl="0">
       <w:start w:val="1"/>
       <w:numFmt w:val="decimal"/>
-      <w:pStyle w:val="a0"/>
+      <w:pStyle w:val="ListNumber"/>
       <w:lvlText w:val="%1)"/>
       <w:lvlJc w:val="left"/>
       <w:pPr>
@@ -2028,7 +2234,7 @@
 </file>
 
 <file path=word/styles.xml><?xml version="1.0" encoding="utf-8"?>
-<w:styles xmlns:mc="http://schemas.openxmlformats.org/markup-compatibility/2006" xmlns:r="http://schemas.openxmlformats.org/officeDocument/2006/relationships" xmlns:w="http://schemas.openxmlformats.org/wordprocessingml/2006/main" xmlns:w14="http://schemas.microsoft.com/office/word/2010/wordml" xmlns:w15="http://schemas.microsoft.com/office/word/2012/wordml" xmlns:w16cex="http://schemas.microsoft.com/office/word/2018/wordml/cex" xmlns:w16cid="http://schemas.microsoft.com/office/word/2016/wordml/cid" xmlns:w16="http://schemas.microsoft.com/office/word/2018/wordml" xmlns:w16du="http://schemas.microsoft.com/office/word/2023/wordml/word16du" xmlns:w16sdtdh="http://schemas.microsoft.com/office/word/2020/wordml/sdtdatahash" xmlns:w16sdtfl="http://schemas.microsoft.com/office/word/2024/wordml/sdtformatlock" xmlns:w16se="http://schemas.microsoft.com/office/word/2015/wordml/symex" mc:Ignorable="w14 w15 w16se w16cid w16 w16cex w16sdtdh w16sdtfl w16du">
+<w:styles xmlns:mc="http://schemas.openxmlformats.org/markup-compatibility/2006" xmlns:r="http://schemas.openxmlformats.org/officeDocument/2006/relationships" xmlns:w="http://schemas.openxmlformats.org/wordprocessingml/2006/main" xmlns:w14="http://schemas.microsoft.com/office/word/2010/wordml" xmlns:w15="http://schemas.microsoft.com/office/word/2012/wordml" xmlns:w16cex="http://schemas.microsoft.com/office/word/2018/wordml/cex" xmlns:w16cid="http://schemas.microsoft.com/office/word/2016/wordml/cid" xmlns:w16="http://schemas.microsoft.com/office/word/2018/wordml" xmlns:w16du="http://schemas.microsoft.com/office/word/2023/wordml/word16du" xmlns:w16sdtdh="http://schemas.microsoft.com/office/word/2020/wordml/sdtdatahash" xmlns:w16se="http://schemas.microsoft.com/office/word/2015/wordml/symex" mc:Ignorable="w14 w15 w16se w16cid w16 w16cex w16sdtdh w16du">
   <w:docDefaults>
     <w:rPrDefault>
       <w:rPr>
@@ -2423,16 +2629,16 @@
     <w:lsdException w:name="Unresolved Mention" w:semiHidden="1" w:unhideWhenUsed="1"/>
     <w:lsdException w:name="Smart Link" w:semiHidden="1" w:unhideWhenUsed="1"/>
   </w:latentStyles>
-  <w:style w:type="paragraph" w:default="1" w:styleId="a1">
+  <w:style w:type="paragraph" w:default="1" w:styleId="Normal">
     <w:name w:val="Normal"/>
     <w:qFormat/>
     <w:rsid w:val="00986CA0"/>
   </w:style>
-  <w:style w:type="paragraph" w:styleId="1">
+  <w:style w:type="paragraph" w:styleId="Heading1">
     <w:name w:val="heading 1"/>
-    <w:basedOn w:val="a1"/>
-    <w:next w:val="a1"/>
-    <w:link w:val="10"/>
+    <w:basedOn w:val="Normal"/>
+    <w:next w:val="Normal"/>
+    <w:link w:val="Heading1Char"/>
     <w:uiPriority w:val="9"/>
     <w:qFormat/>
     <w:rsid w:val="001B29CF"/>
@@ -2451,11 +2657,11 @@
       <w:szCs w:val="32"/>
     </w:rPr>
   </w:style>
-  <w:style w:type="paragraph" w:styleId="2">
+  <w:style w:type="paragraph" w:styleId="Heading2">
     <w:name w:val="heading 2"/>
-    <w:basedOn w:val="a1"/>
-    <w:next w:val="a1"/>
-    <w:link w:val="20"/>
+    <w:basedOn w:val="Normal"/>
+    <w:next w:val="Normal"/>
+    <w:link w:val="Heading2Char"/>
     <w:uiPriority w:val="9"/>
     <w:unhideWhenUsed/>
     <w:qFormat/>
@@ -2476,11 +2682,11 @@
       <w:szCs w:val="26"/>
     </w:rPr>
   </w:style>
-  <w:style w:type="paragraph" w:styleId="8">
+  <w:style w:type="paragraph" w:styleId="Heading8">
     <w:name w:val="heading 8"/>
-    <w:basedOn w:val="a1"/>
-    <w:next w:val="a1"/>
-    <w:link w:val="80"/>
+    <w:basedOn w:val="Normal"/>
+    <w:next w:val="Normal"/>
+    <w:link w:val="Heading8Char"/>
     <w:uiPriority w:val="9"/>
     <w:semiHidden/>
     <w:unhideWhenUsed/>
@@ -2498,11 +2704,11 @@
       <w:szCs w:val="21"/>
     </w:rPr>
   </w:style>
-  <w:style w:type="paragraph" w:styleId="9">
+  <w:style w:type="paragraph" w:styleId="Heading9">
     <w:name w:val="heading 9"/>
-    <w:basedOn w:val="a1"/>
-    <w:next w:val="a1"/>
-    <w:link w:val="90"/>
+    <w:basedOn w:val="Normal"/>
+    <w:next w:val="Normal"/>
+    <w:link w:val="Heading9Char"/>
     <w:uiPriority w:val="9"/>
     <w:semiHidden/>
     <w:unhideWhenUsed/>
@@ -2522,13 +2728,13 @@
       <w:szCs w:val="21"/>
     </w:rPr>
   </w:style>
-  <w:style w:type="character" w:default="1" w:styleId="a2">
+  <w:style w:type="character" w:default="1" w:styleId="DefaultParagraphFont">
     <w:name w:val="Default Paragraph Font"/>
     <w:uiPriority w:val="1"/>
     <w:semiHidden/>
     <w:unhideWhenUsed/>
   </w:style>
-  <w:style w:type="table" w:default="1" w:styleId="a3">
+  <w:style w:type="table" w:default="1" w:styleId="TableNormal">
     <w:name w:val="Normal Table"/>
     <w:uiPriority w:val="99"/>
     <w:semiHidden/>
@@ -2543,16 +2749,16 @@
       </w:tblCellMar>
     </w:tblPr>
   </w:style>
-  <w:style w:type="numbering" w:default="1" w:styleId="a4">
+  <w:style w:type="numbering" w:default="1" w:styleId="NoList">
     <w:name w:val="No List"/>
     <w:uiPriority w:val="99"/>
     <w:semiHidden/>
     <w:unhideWhenUsed/>
   </w:style>
-  <w:style w:type="paragraph" w:styleId="a5">
+  <w:style w:type="paragraph" w:styleId="Title">
     <w:name w:val="Title"/>
-    <w:basedOn w:val="a1"/>
-    <w:link w:val="a6"/>
+    <w:basedOn w:val="Normal"/>
+    <w:link w:val="TitleChar"/>
     <w:uiPriority w:val="1"/>
     <w:qFormat/>
     <w:rsid w:val="00545B7A"/>
@@ -2567,10 +2773,10 @@
       <w:sz w:val="56"/>
     </w:rPr>
   </w:style>
-  <w:style w:type="character" w:customStyle="1" w:styleId="a6">
-    <w:name w:val="标题 字符"/>
-    <w:basedOn w:val="a2"/>
-    <w:link w:val="a5"/>
+  <w:style w:type="character" w:customStyle="1" w:styleId="TitleChar">
+    <w:name w:val="Title Char"/>
+    <w:basedOn w:val="DefaultParagraphFont"/>
+    <w:link w:val="Title"/>
     <w:uiPriority w:val="1"/>
     <w:rsid w:val="00545B7A"/>
     <w:rPr>
@@ -2580,9 +2786,9 @@
       <w:sz w:val="56"/>
     </w:rPr>
   </w:style>
-  <w:style w:type="character" w:styleId="a7">
+  <w:style w:type="character" w:styleId="PlaceholderText">
     <w:name w:val="Placeholder Text"/>
-    <w:basedOn w:val="a2"/>
+    <w:basedOn w:val="DefaultParagraphFont"/>
     <w:uiPriority w:val="99"/>
     <w:semiHidden/>
     <w:rsid w:val="00E83E4B"/>
@@ -2590,9 +2796,9 @@
       <w:color w:val="393939" w:themeColor="text2" w:themeShade="BF"/>
     </w:rPr>
   </w:style>
-  <w:style w:type="paragraph" w:styleId="a">
+  <w:style w:type="paragraph" w:styleId="ListBullet">
     <w:name w:val="List Bullet"/>
-    <w:basedOn w:val="a1"/>
+    <w:basedOn w:val="Normal"/>
     <w:uiPriority w:val="10"/>
     <w:unhideWhenUsed/>
     <w:qFormat/>
@@ -2605,28 +2811,28 @@
       <w:contextualSpacing/>
     </w:pPr>
   </w:style>
-  <w:style w:type="paragraph" w:styleId="a8">
+  <w:style w:type="paragraph" w:styleId="Header">
     <w:name w:val="header"/>
-    <w:basedOn w:val="a1"/>
-    <w:link w:val="a9"/>
+    <w:basedOn w:val="Normal"/>
+    <w:link w:val="HeaderChar"/>
     <w:uiPriority w:val="99"/>
     <w:semiHidden/>
     <w:pPr>
       <w:spacing w:after="0"/>
     </w:pPr>
   </w:style>
-  <w:style w:type="character" w:customStyle="1" w:styleId="a9">
-    <w:name w:val="页眉 字符"/>
-    <w:basedOn w:val="a2"/>
-    <w:link w:val="a8"/>
+  <w:style w:type="character" w:customStyle="1" w:styleId="HeaderChar">
+    <w:name w:val="Header Char"/>
+    <w:basedOn w:val="DefaultParagraphFont"/>
+    <w:link w:val="Header"/>
     <w:uiPriority w:val="99"/>
     <w:semiHidden/>
     <w:rsid w:val="00986CA0"/>
   </w:style>
-  <w:style w:type="paragraph" w:styleId="aa">
+  <w:style w:type="paragraph" w:styleId="Footer">
     <w:name w:val="footer"/>
-    <w:basedOn w:val="a1"/>
-    <w:link w:val="ab"/>
+    <w:basedOn w:val="Normal"/>
+    <w:link w:val="FooterChar"/>
     <w:uiPriority w:val="99"/>
     <w:semiHidden/>
     <w:rsid w:val="00681034"/>
@@ -2638,10 +2844,10 @@
       <w:color w:val="2A7B88" w:themeColor="accent1" w:themeShade="BF"/>
     </w:rPr>
   </w:style>
-  <w:style w:type="character" w:customStyle="1" w:styleId="ab">
-    <w:name w:val="页脚 字符"/>
-    <w:basedOn w:val="a2"/>
-    <w:link w:val="aa"/>
+  <w:style w:type="character" w:customStyle="1" w:styleId="FooterChar">
+    <w:name w:val="Footer Char"/>
+    <w:basedOn w:val="DefaultParagraphFont"/>
+    <w:link w:val="Footer"/>
     <w:uiPriority w:val="99"/>
     <w:semiHidden/>
     <w:rsid w:val="00986CA0"/>
@@ -2649,10 +2855,10 @@
       <w:color w:val="2A7B88" w:themeColor="accent1" w:themeShade="BF"/>
     </w:rPr>
   </w:style>
-  <w:style w:type="character" w:customStyle="1" w:styleId="10">
-    <w:name w:val="标题 1 字符"/>
-    <w:basedOn w:val="a2"/>
-    <w:link w:val="1"/>
+  <w:style w:type="character" w:customStyle="1" w:styleId="Heading1Char">
+    <w:name w:val="Heading 1 Char"/>
+    <w:basedOn w:val="DefaultParagraphFont"/>
+    <w:link w:val="Heading1"/>
     <w:uiPriority w:val="9"/>
     <w:rsid w:val="001B29CF"/>
     <w:rPr>
@@ -2663,10 +2869,10 @@
       <w:szCs w:val="32"/>
     </w:rPr>
   </w:style>
-  <w:style w:type="character" w:customStyle="1" w:styleId="20">
-    <w:name w:val="标题 2 字符"/>
-    <w:basedOn w:val="a2"/>
-    <w:link w:val="2"/>
+  <w:style w:type="character" w:customStyle="1" w:styleId="Heading2Char">
+    <w:name w:val="Heading 2 Char"/>
+    <w:basedOn w:val="DefaultParagraphFont"/>
+    <w:link w:val="Heading2"/>
     <w:uiPriority w:val="9"/>
     <w:rsid w:val="001B29CF"/>
     <w:rPr>
@@ -2678,10 +2884,10 @@
       <w:szCs w:val="26"/>
     </w:rPr>
   </w:style>
-  <w:style w:type="paragraph" w:styleId="TOC">
+  <w:style w:type="paragraph" w:styleId="TOCHeading">
     <w:name w:val="TOC Heading"/>
-    <w:basedOn w:val="1"/>
-    <w:next w:val="a1"/>
+    <w:basedOn w:val="Heading1"/>
+    <w:next w:val="Normal"/>
     <w:uiPriority w:val="39"/>
     <w:semiHidden/>
     <w:unhideWhenUsed/>
@@ -2691,9 +2897,9 @@
       <w:outlineLvl w:val="9"/>
     </w:pPr>
   </w:style>
-  <w:style w:type="character" w:styleId="ac">
+  <w:style w:type="character" w:styleId="IntenseEmphasis">
     <w:name w:val="Intense Emphasis"/>
-    <w:basedOn w:val="a2"/>
+    <w:basedOn w:val="DefaultParagraphFont"/>
     <w:uiPriority w:val="21"/>
     <w:semiHidden/>
     <w:unhideWhenUsed/>
@@ -2704,9 +2910,9 @@
       <w:color w:val="2A7B88" w:themeColor="accent1" w:themeShade="BF"/>
     </w:rPr>
   </w:style>
-  <w:style w:type="character" w:styleId="ad">
+  <w:style w:type="character" w:styleId="IntenseReference">
     <w:name w:val="Intense Reference"/>
-    <w:basedOn w:val="a2"/>
+    <w:basedOn w:val="DefaultParagraphFont"/>
     <w:uiPriority w:val="32"/>
     <w:semiHidden/>
     <w:unhideWhenUsed/>
@@ -2720,11 +2926,11 @@
       <w:spacing w:val="5"/>
     </w:rPr>
   </w:style>
-  <w:style w:type="paragraph" w:styleId="ae">
+  <w:style w:type="paragraph" w:styleId="IntenseQuote">
     <w:name w:val="Intense Quote"/>
-    <w:basedOn w:val="a1"/>
-    <w:next w:val="a1"/>
-    <w:link w:val="af"/>
+    <w:basedOn w:val="Normal"/>
+    <w:next w:val="Normal"/>
+    <w:link w:val="IntenseQuoteChar"/>
     <w:uiPriority w:val="30"/>
     <w:semiHidden/>
     <w:unhideWhenUsed/>
@@ -2744,10 +2950,10 @@
       <w:color w:val="2A7B88" w:themeColor="accent1" w:themeShade="BF"/>
     </w:rPr>
   </w:style>
-  <w:style w:type="character" w:customStyle="1" w:styleId="af">
-    <w:name w:val="明显引用 字符"/>
-    <w:basedOn w:val="a2"/>
-    <w:link w:val="ae"/>
+  <w:style w:type="character" w:customStyle="1" w:styleId="IntenseQuoteChar">
+    <w:name w:val="Intense Quote Char"/>
+    <w:basedOn w:val="DefaultParagraphFont"/>
+    <w:link w:val="IntenseQuote"/>
     <w:uiPriority w:val="30"/>
     <w:semiHidden/>
     <w:rPr>
@@ -2756,9 +2962,9 @@
       <w:color w:val="2A7B88" w:themeColor="accent1" w:themeShade="BF"/>
     </w:rPr>
   </w:style>
-  <w:style w:type="paragraph" w:styleId="a0">
+  <w:style w:type="paragraph" w:styleId="ListNumber">
     <w:name w:val="List Number"/>
-    <w:basedOn w:val="a1"/>
+    <w:basedOn w:val="Normal"/>
     <w:uiPriority w:val="11"/>
     <w:semiHidden/>
     <w:rsid w:val="0087734B"/>
@@ -2770,9 +2976,9 @@
       <w:contextualSpacing/>
     </w:pPr>
   </w:style>
-  <w:style w:type="character" w:styleId="af0">
+  <w:style w:type="character" w:styleId="FollowedHyperlink">
     <w:name w:val="FollowedHyperlink"/>
-    <w:basedOn w:val="a2"/>
+    <w:basedOn w:val="DefaultParagraphFont"/>
     <w:uiPriority w:val="99"/>
     <w:semiHidden/>
     <w:unhideWhenUsed/>
@@ -2782,9 +2988,9 @@
       <w:u w:val="single"/>
     </w:rPr>
   </w:style>
-  <w:style w:type="character" w:styleId="af1">
+  <w:style w:type="character" w:styleId="Hyperlink">
     <w:name w:val="Hyperlink"/>
-    <w:basedOn w:val="a2"/>
+    <w:basedOn w:val="DefaultParagraphFont"/>
     <w:uiPriority w:val="99"/>
     <w:semiHidden/>
     <w:rsid w:val="00E83E4B"/>
@@ -2793,10 +2999,10 @@
       <w:u w:val="single"/>
     </w:rPr>
   </w:style>
-  <w:style w:type="paragraph" w:styleId="3">
+  <w:style w:type="paragraph" w:styleId="BodyText3">
     <w:name w:val="Body Text 3"/>
-    <w:basedOn w:val="a1"/>
-    <w:link w:val="30"/>
+    <w:basedOn w:val="Normal"/>
+    <w:link w:val="BodyText3Char"/>
     <w:uiPriority w:val="99"/>
     <w:semiHidden/>
     <w:unhideWhenUsed/>
@@ -2808,10 +3014,10 @@
       <w:szCs w:val="16"/>
     </w:rPr>
   </w:style>
-  <w:style w:type="character" w:customStyle="1" w:styleId="30">
-    <w:name w:val="正文文本 3 字符"/>
-    <w:basedOn w:val="a2"/>
-    <w:link w:val="3"/>
+  <w:style w:type="character" w:customStyle="1" w:styleId="BodyText3Char">
+    <w:name w:val="Body Text 3 Char"/>
+    <w:basedOn w:val="DefaultParagraphFont"/>
+    <w:link w:val="BodyText3"/>
     <w:uiPriority w:val="99"/>
     <w:semiHidden/>
     <w:rsid w:val="00E83E4B"/>
@@ -2819,9 +3025,9 @@
       <w:szCs w:val="16"/>
     </w:rPr>
   </w:style>
-  <w:style w:type="paragraph" w:styleId="af2">
+  <w:style w:type="paragraph" w:styleId="BlockText">
     <w:name w:val="Block Text"/>
-    <w:basedOn w:val="a1"/>
+    <w:basedOn w:val="Normal"/>
     <w:uiPriority w:val="99"/>
     <w:semiHidden/>
     <w:unhideWhenUsed/>
@@ -2841,10 +3047,10 @@
       <w:color w:val="2A7B88" w:themeColor="accent1" w:themeShade="BF"/>
     </w:rPr>
   </w:style>
-  <w:style w:type="paragraph" w:styleId="31">
+  <w:style w:type="paragraph" w:styleId="BodyTextIndent3">
     <w:name w:val="Body Text Indent 3"/>
-    <w:basedOn w:val="a1"/>
-    <w:link w:val="32"/>
+    <w:basedOn w:val="Normal"/>
+    <w:link w:val="BodyTextIndent3Char"/>
     <w:uiPriority w:val="99"/>
     <w:semiHidden/>
     <w:unhideWhenUsed/>
@@ -2857,10 +3063,10 @@
       <w:szCs w:val="16"/>
     </w:rPr>
   </w:style>
-  <w:style w:type="character" w:customStyle="1" w:styleId="32">
-    <w:name w:val="正文文本缩进 3 字符"/>
-    <w:basedOn w:val="a2"/>
-    <w:link w:val="31"/>
+  <w:style w:type="character" w:customStyle="1" w:styleId="BodyTextIndent3Char">
+    <w:name w:val="Body Text Indent 3 Char"/>
+    <w:basedOn w:val="DefaultParagraphFont"/>
+    <w:link w:val="BodyTextIndent3"/>
     <w:uiPriority w:val="99"/>
     <w:semiHidden/>
     <w:rsid w:val="00E83E4B"/>
@@ -2868,9 +3074,9 @@
       <w:szCs w:val="16"/>
     </w:rPr>
   </w:style>
-  <w:style w:type="character" w:styleId="af3">
+  <w:style w:type="character" w:styleId="CommentReference">
     <w:name w:val="annotation reference"/>
-    <w:basedOn w:val="a2"/>
+    <w:basedOn w:val="DefaultParagraphFont"/>
     <w:uiPriority w:val="99"/>
     <w:semiHidden/>
     <w:unhideWhenUsed/>
@@ -2880,10 +3086,10 @@
       <w:szCs w:val="16"/>
     </w:rPr>
   </w:style>
-  <w:style w:type="paragraph" w:styleId="af4">
+  <w:style w:type="paragraph" w:styleId="DocumentMap">
     <w:name w:val="Document Map"/>
-    <w:basedOn w:val="a1"/>
-    <w:link w:val="af5"/>
+    <w:basedOn w:val="Normal"/>
+    <w:link w:val="DocumentMapChar"/>
     <w:uiPriority w:val="99"/>
     <w:semiHidden/>
     <w:unhideWhenUsed/>
@@ -2896,10 +3102,10 @@
       <w:szCs w:val="16"/>
     </w:rPr>
   </w:style>
-  <w:style w:type="character" w:customStyle="1" w:styleId="af5">
-    <w:name w:val="文档结构图 字符"/>
-    <w:basedOn w:val="a2"/>
-    <w:link w:val="af4"/>
+  <w:style w:type="character" w:customStyle="1" w:styleId="DocumentMapChar">
+    <w:name w:val="Document Map Char"/>
+    <w:basedOn w:val="DefaultParagraphFont"/>
+    <w:link w:val="DocumentMap"/>
     <w:uiPriority w:val="99"/>
     <w:semiHidden/>
     <w:rsid w:val="00E83E4B"/>
@@ -2908,10 +3114,10 @@
       <w:szCs w:val="16"/>
     </w:rPr>
   </w:style>
-  <w:style w:type="character" w:customStyle="1" w:styleId="80">
-    <w:name w:val="标题 8 字符"/>
-    <w:basedOn w:val="a2"/>
-    <w:link w:val="8"/>
+  <w:style w:type="character" w:customStyle="1" w:styleId="Heading8Char">
+    <w:name w:val="Heading 8 Char"/>
+    <w:basedOn w:val="DefaultParagraphFont"/>
+    <w:link w:val="Heading8"/>
     <w:uiPriority w:val="9"/>
     <w:semiHidden/>
     <w:rsid w:val="0028220F"/>
@@ -2921,10 +3127,10 @@
       <w:szCs w:val="21"/>
     </w:rPr>
   </w:style>
-  <w:style w:type="character" w:customStyle="1" w:styleId="90">
-    <w:name w:val="标题 9 字符"/>
-    <w:basedOn w:val="a2"/>
-    <w:link w:val="9"/>
+  <w:style w:type="character" w:customStyle="1" w:styleId="Heading9Char">
+    <w:name w:val="Heading 9 Char"/>
+    <w:basedOn w:val="DefaultParagraphFont"/>
+    <w:link w:val="Heading9"/>
     <w:uiPriority w:val="9"/>
     <w:semiHidden/>
     <w:rsid w:val="0028220F"/>
@@ -2936,10 +3142,10 @@
       <w:szCs w:val="21"/>
     </w:rPr>
   </w:style>
-  <w:style w:type="paragraph" w:styleId="af6">
+  <w:style w:type="paragraph" w:styleId="Caption">
     <w:name w:val="caption"/>
-    <w:basedOn w:val="a1"/>
-    <w:next w:val="a1"/>
+    <w:basedOn w:val="Normal"/>
+    <w:next w:val="Normal"/>
     <w:uiPriority w:val="35"/>
     <w:semiHidden/>
     <w:unhideWhenUsed/>
@@ -2955,10 +3161,10 @@
       <w:szCs w:val="18"/>
     </w:rPr>
   </w:style>
-  <w:style w:type="paragraph" w:styleId="af7">
+  <w:style w:type="paragraph" w:styleId="BalloonText">
     <w:name w:val="Balloon Text"/>
-    <w:basedOn w:val="a1"/>
-    <w:link w:val="af8"/>
+    <w:basedOn w:val="Normal"/>
+    <w:link w:val="BalloonTextChar"/>
     <w:uiPriority w:val="99"/>
     <w:semiHidden/>
     <w:unhideWhenUsed/>
@@ -2971,10 +3177,10 @@
       <w:szCs w:val="18"/>
     </w:rPr>
   </w:style>
-  <w:style w:type="character" w:customStyle="1" w:styleId="af8">
-    <w:name w:val="批注框文本 字符"/>
-    <w:basedOn w:val="a2"/>
-    <w:link w:val="af7"/>
+  <w:style w:type="character" w:customStyle="1" w:styleId="BalloonTextChar">
+    <w:name w:val="Balloon Text Char"/>
+    <w:basedOn w:val="DefaultParagraphFont"/>
+    <w:link w:val="BalloonText"/>
     <w:uiPriority w:val="99"/>
     <w:semiHidden/>
     <w:rsid w:val="0028220F"/>
@@ -2983,10 +3189,10 @@
       <w:szCs w:val="18"/>
     </w:rPr>
   </w:style>
-  <w:style w:type="paragraph" w:styleId="af9">
+  <w:style w:type="paragraph" w:styleId="CommentText">
     <w:name w:val="annotation text"/>
-    <w:basedOn w:val="a1"/>
-    <w:link w:val="afa"/>
+    <w:basedOn w:val="Normal"/>
+    <w:link w:val="CommentTextChar"/>
     <w:uiPriority w:val="99"/>
     <w:semiHidden/>
     <w:unhideWhenUsed/>
@@ -2995,10 +3201,10 @@
       <w:szCs w:val="20"/>
     </w:rPr>
   </w:style>
-  <w:style w:type="character" w:customStyle="1" w:styleId="afa">
-    <w:name w:val="批注文字 字符"/>
-    <w:basedOn w:val="a2"/>
-    <w:link w:val="af9"/>
+  <w:style w:type="character" w:customStyle="1" w:styleId="CommentTextChar">
+    <w:name w:val="Comment Text Char"/>
+    <w:basedOn w:val="DefaultParagraphFont"/>
+    <w:link w:val="CommentText"/>
     <w:uiPriority w:val="99"/>
     <w:semiHidden/>
     <w:rsid w:val="0028220F"/>
@@ -3006,11 +3212,11 @@
       <w:szCs w:val="20"/>
     </w:rPr>
   </w:style>
-  <w:style w:type="paragraph" w:styleId="afb">
+  <w:style w:type="paragraph" w:styleId="CommentSubject">
     <w:name w:val="annotation subject"/>
-    <w:basedOn w:val="af9"/>
-    <w:next w:val="af9"/>
-    <w:link w:val="afc"/>
+    <w:basedOn w:val="CommentText"/>
+    <w:next w:val="CommentText"/>
+    <w:link w:val="CommentSubjectChar"/>
     <w:uiPriority w:val="99"/>
     <w:semiHidden/>
     <w:unhideWhenUsed/>
@@ -3020,10 +3226,10 @@
       <w:bCs/>
     </w:rPr>
   </w:style>
-  <w:style w:type="character" w:customStyle="1" w:styleId="afc">
-    <w:name w:val="批注主题 字符"/>
-    <w:basedOn w:val="afa"/>
-    <w:link w:val="afb"/>
+  <w:style w:type="character" w:customStyle="1" w:styleId="CommentSubjectChar">
+    <w:name w:val="Comment Subject Char"/>
+    <w:basedOn w:val="CommentTextChar"/>
+    <w:link w:val="CommentSubject"/>
     <w:uiPriority w:val="99"/>
     <w:semiHidden/>
     <w:rsid w:val="0028220F"/>
@@ -3033,10 +3239,10 @@
       <w:szCs w:val="20"/>
     </w:rPr>
   </w:style>
-  <w:style w:type="paragraph" w:styleId="afd">
+  <w:style w:type="paragraph" w:styleId="EndnoteText">
     <w:name w:val="endnote text"/>
-    <w:basedOn w:val="a1"/>
-    <w:link w:val="afe"/>
+    <w:basedOn w:val="Normal"/>
+    <w:link w:val="EndnoteTextChar"/>
     <w:uiPriority w:val="99"/>
     <w:semiHidden/>
     <w:unhideWhenUsed/>
@@ -3048,10 +3254,10 @@
       <w:szCs w:val="20"/>
     </w:rPr>
   </w:style>
-  <w:style w:type="character" w:customStyle="1" w:styleId="afe">
-    <w:name w:val="尾注文本 字符"/>
-    <w:basedOn w:val="a2"/>
-    <w:link w:val="afd"/>
+  <w:style w:type="character" w:customStyle="1" w:styleId="EndnoteTextChar">
+    <w:name w:val="Endnote Text Char"/>
+    <w:basedOn w:val="DefaultParagraphFont"/>
+    <w:link w:val="EndnoteText"/>
     <w:uiPriority w:val="99"/>
     <w:semiHidden/>
     <w:rsid w:val="0028220F"/>
@@ -3059,9 +3265,9 @@
       <w:szCs w:val="20"/>
     </w:rPr>
   </w:style>
-  <w:style w:type="paragraph" w:styleId="aff">
+  <w:style w:type="paragraph" w:styleId="EnvelopeReturn">
     <w:name w:val="envelope return"/>
-    <w:basedOn w:val="a1"/>
+    <w:basedOn w:val="Normal"/>
     <w:uiPriority w:val="99"/>
     <w:semiHidden/>
     <w:unhideWhenUsed/>
@@ -3074,10 +3280,10 @@
       <w:szCs w:val="20"/>
     </w:rPr>
   </w:style>
-  <w:style w:type="paragraph" w:styleId="aff0">
+  <w:style w:type="paragraph" w:styleId="FootnoteText">
     <w:name w:val="footnote text"/>
-    <w:basedOn w:val="a1"/>
-    <w:link w:val="aff1"/>
+    <w:basedOn w:val="Normal"/>
+    <w:link w:val="FootnoteTextChar"/>
     <w:uiPriority w:val="99"/>
     <w:semiHidden/>
     <w:unhideWhenUsed/>
@@ -3089,10 +3295,10 @@
       <w:szCs w:val="20"/>
     </w:rPr>
   </w:style>
-  <w:style w:type="character" w:customStyle="1" w:styleId="aff1">
-    <w:name w:val="脚注文本 字符"/>
-    <w:basedOn w:val="a2"/>
-    <w:link w:val="aff0"/>
+  <w:style w:type="character" w:customStyle="1" w:styleId="FootnoteTextChar">
+    <w:name w:val="Footnote Text Char"/>
+    <w:basedOn w:val="DefaultParagraphFont"/>
+    <w:link w:val="FootnoteText"/>
     <w:uiPriority w:val="99"/>
     <w:semiHidden/>
     <w:rsid w:val="0028220F"/>
@@ -3100,9 +3306,9 @@
       <w:szCs w:val="20"/>
     </w:rPr>
   </w:style>
-  <w:style w:type="character" w:styleId="HTML">
+  <w:style w:type="character" w:styleId="HTMLCode">
     <w:name w:val="HTML Code"/>
-    <w:basedOn w:val="a2"/>
+    <w:basedOn w:val="DefaultParagraphFont"/>
     <w:uiPriority w:val="99"/>
     <w:semiHidden/>
     <w:unhideWhenUsed/>
@@ -3113,9 +3319,9 @@
       <w:szCs w:val="20"/>
     </w:rPr>
   </w:style>
-  <w:style w:type="character" w:styleId="HTML0">
+  <w:style w:type="character" w:styleId="HTMLKeyboard">
     <w:name w:val="HTML Keyboard"/>
-    <w:basedOn w:val="a2"/>
+    <w:basedOn w:val="DefaultParagraphFont"/>
     <w:uiPriority w:val="99"/>
     <w:semiHidden/>
     <w:unhideWhenUsed/>
@@ -3126,10 +3332,10 @@
       <w:szCs w:val="20"/>
     </w:rPr>
   </w:style>
-  <w:style w:type="paragraph" w:styleId="HTML1">
+  <w:style w:type="paragraph" w:styleId="HTMLPreformatted">
     <w:name w:val="HTML Preformatted"/>
-    <w:basedOn w:val="a1"/>
-    <w:link w:val="HTML2"/>
+    <w:basedOn w:val="Normal"/>
+    <w:link w:val="HTMLPreformattedChar"/>
     <w:uiPriority w:val="99"/>
     <w:semiHidden/>
     <w:unhideWhenUsed/>
@@ -3142,10 +3348,10 @@
       <w:szCs w:val="20"/>
     </w:rPr>
   </w:style>
-  <w:style w:type="character" w:customStyle="1" w:styleId="HTML2">
-    <w:name w:val="HTML 预设格式 字符"/>
-    <w:basedOn w:val="a2"/>
-    <w:link w:val="HTML1"/>
+  <w:style w:type="character" w:customStyle="1" w:styleId="HTMLPreformattedChar">
+    <w:name w:val="HTML Preformatted Char"/>
+    <w:basedOn w:val="DefaultParagraphFont"/>
+    <w:link w:val="HTMLPreformatted"/>
     <w:uiPriority w:val="99"/>
     <w:semiHidden/>
     <w:rsid w:val="0028220F"/>
@@ -3154,9 +3360,9 @@
       <w:szCs w:val="20"/>
     </w:rPr>
   </w:style>
-  <w:style w:type="character" w:styleId="HTML3">
+  <w:style w:type="character" w:styleId="HTMLTypewriter">
     <w:name w:val="HTML Typewriter"/>
-    <w:basedOn w:val="a2"/>
+    <w:basedOn w:val="DefaultParagraphFont"/>
     <w:uiPriority w:val="99"/>
     <w:semiHidden/>
     <w:unhideWhenUsed/>
@@ -3167,9 +3373,9 @@
       <w:szCs w:val="20"/>
     </w:rPr>
   </w:style>
-  <w:style w:type="paragraph" w:styleId="aff2">
+  <w:style w:type="paragraph" w:styleId="MacroText">
     <w:name w:val="macro"/>
-    <w:link w:val="aff3"/>
+    <w:link w:val="MacroTextChar"/>
     <w:uiPriority w:val="99"/>
     <w:semiHidden/>
     <w:unhideWhenUsed/>
@@ -3193,10 +3399,10 @@
       <w:szCs w:val="20"/>
     </w:rPr>
   </w:style>
-  <w:style w:type="character" w:customStyle="1" w:styleId="aff3">
-    <w:name w:val="宏文本 字符"/>
-    <w:basedOn w:val="a2"/>
-    <w:link w:val="aff2"/>
+  <w:style w:type="character" w:customStyle="1" w:styleId="MacroTextChar">
+    <w:name w:val="Macro Text Char"/>
+    <w:basedOn w:val="DefaultParagraphFont"/>
+    <w:link w:val="MacroText"/>
     <w:uiPriority w:val="99"/>
     <w:semiHidden/>
     <w:rsid w:val="0028220F"/>
@@ -3205,10 +3411,10 @@
       <w:szCs w:val="20"/>
     </w:rPr>
   </w:style>
-  <w:style w:type="paragraph" w:styleId="aff4">
+  <w:style w:type="paragraph" w:styleId="PlainText">
     <w:name w:val="Plain Text"/>
-    <w:basedOn w:val="a1"/>
-    <w:link w:val="aff5"/>
+    <w:basedOn w:val="Normal"/>
+    <w:link w:val="PlainTextChar"/>
     <w:uiPriority w:val="99"/>
     <w:semiHidden/>
     <w:unhideWhenUsed/>
@@ -3221,10 +3427,10 @@
       <w:szCs w:val="21"/>
     </w:rPr>
   </w:style>
-  <w:style w:type="character" w:customStyle="1" w:styleId="aff5">
-    <w:name w:val="纯文本 字符"/>
-    <w:basedOn w:val="a2"/>
-    <w:link w:val="aff4"/>
+  <w:style w:type="character" w:customStyle="1" w:styleId="PlainTextChar">
+    <w:name w:val="Plain Text Char"/>
+    <w:basedOn w:val="DefaultParagraphFont"/>
+    <w:link w:val="PlainText"/>
     <w:uiPriority w:val="99"/>
     <w:semiHidden/>
     <w:rsid w:val="0028220F"/>
@@ -3233,9 +3439,9 @@
       <w:szCs w:val="21"/>
     </w:rPr>
   </w:style>
-  <w:style w:type="character" w:styleId="aff6">
+  <w:style w:type="character" w:styleId="UnresolvedMention">
     <w:name w:val="Unresolved Mention"/>
-    <w:basedOn w:val="a2"/>
+    <w:basedOn w:val="DefaultParagraphFont"/>
     <w:uiPriority w:val="99"/>
     <w:semiHidden/>
     <w:unhideWhenUsed/>
@@ -3247,7 +3453,7 @@
   </w:style>
   <w:style w:type="paragraph" w:customStyle="1" w:styleId="Contact">
     <w:name w:val="Contact"/>
-    <w:basedOn w:val="a1"/>
+    <w:basedOn w:val="Normal"/>
     <w:link w:val="ContactChar"/>
     <w:uiPriority w:val="99"/>
     <w:qFormat/>
@@ -3259,9 +3465,9 @@
       <w:sz w:val="20"/>
     </w:rPr>
   </w:style>
-  <w:style w:type="table" w:styleId="aff7">
+  <w:style w:type="table" w:styleId="TableGrid">
     <w:name w:val="Table Grid"/>
-    <w:basedOn w:val="a3"/>
+    <w:basedOn w:val="TableNormal"/>
     <w:uiPriority w:val="39"/>
     <w:rsid w:val="00545B7A"/>
     <w:pPr>
@@ -3280,7 +3486,7 @@
   </w:style>
   <w:style w:type="character" w:customStyle="1" w:styleId="ContactChar">
     <w:name w:val="Contact Char"/>
-    <w:basedOn w:val="a2"/>
+    <w:basedOn w:val="DefaultParagraphFont"/>
     <w:link w:val="Contact"/>
     <w:uiPriority w:val="99"/>
     <w:rsid w:val="00986CA0"/>
@@ -3291,7 +3497,7 @@
 </w:styles>
 </file>
 
-<file path=word/theme/theme1.xml><?xml version="1.0" encoding="utf-8"?>
+<file path=word/theme/theme11.xml><?xml version="1.0" encoding="utf-8"?>
 <a:theme xmlns:a="http://schemas.openxmlformats.org/drawingml/2006/main" name="Office Theme">
   <a:themeElements>
     <a:clrScheme name="Resume">
@@ -3552,40 +3758,7 @@
 </a:theme>
 </file>
 
-<file path=customXml/item1.xml><?xml version="1.0" encoding="utf-8"?>
-<b:Sources xmlns:b="http://schemas.openxmlformats.org/officeDocument/2006/bibliography" xmlns="http://schemas.openxmlformats.org/officeDocument/2006/bibliography" SelectedStyle="\APASixthEditionOfficeOnline.xsl" StyleName="APA" Version="6"/>
-</file>
-
-<file path=customXml/item2.xml><?xml version="1.0" encoding="utf-8"?>
-<p:properties xmlns:p="http://schemas.microsoft.com/office/2006/metadata/properties" xmlns:xsi="http://www.w3.org/2001/XMLSchema-instance" xmlns:pc="http://schemas.microsoft.com/office/infopath/2007/PartnerControls">
-  <documentManagement>
-    <_ip_UnifiedCompliancePolicyUIAction xmlns="http://schemas.microsoft.com/sharepoint/v3" xsi:nil="true"/>
-    <Image xmlns="71af3243-3dd4-4a8d-8c0d-dd76da1f02a5">
-      <Url xsi:nil="true"/>
-      <Description xsi:nil="true"/>
-    </Image>
-    <Status xmlns="71af3243-3dd4-4a8d-8c0d-dd76da1f02a5">Not started</Status>
-    <_ip_UnifiedCompliancePolicyProperties xmlns="http://schemas.microsoft.com/sharepoint/v3" xsi:nil="true"/>
-    <ImageTagsTaxHTField xmlns="71af3243-3dd4-4a8d-8c0d-dd76da1f02a5">
-      <Terms xmlns="http://schemas.microsoft.com/office/infopath/2007/PartnerControls"/>
-    </ImageTagsTaxHTField>
-    <TaxCatchAll xmlns="230e9df3-be65-4c73-a93b-d1236ebd677e" xsi:nil="true"/>
-    <MediaServiceKeyPoints xmlns="71af3243-3dd4-4a8d-8c0d-dd76da1f02a5" xsi:nil="true"/>
-    <Background xmlns="71af3243-3dd4-4a8d-8c0d-dd76da1f02a5">false</Background>
-  </documentManagement>
-</p:properties>
-</file>
-
-<file path=customXml/item3.xml><?xml version="1.0" encoding="utf-8"?>
-<?mso-contentType ?>
-<FormTemplates xmlns="http://schemas.microsoft.com/sharepoint/v3/contenttype/forms">
-  <Display>DocumentLibraryForm</Display>
-  <Edit>DocumentLibraryForm</Edit>
-  <New>DocumentLibraryForm</New>
-</FormTemplates>
-</file>
-
-<file path=customXml/item4.xml><?xml version="1.0" encoding="utf-8"?>
+<file path=customXml/item13.xml><?xml version="1.0" encoding="utf-8"?>
 <ct:contentTypeSchema xmlns:ct="http://schemas.microsoft.com/office/2006/metadata/contentType" xmlns:ma="http://schemas.microsoft.com/office/2006/metadata/properties/metaAttributes" ct:_="" ma:_="" ma:contentTypeName="Document" ma:contentTypeID="0x01010079F111ED35F8CC479449609E8A0923A6" ma:contentTypeVersion="29" ma:contentTypeDescription="Create a new document." ma:contentTypeScope="" ma:versionID="6a914531ae0f23be31da2eba1f3b42a9">
   <xsd:schema xmlns:xsd="http://www.w3.org/2001/XMLSchema" xmlns:xs="http://www.w3.org/2001/XMLSchema" xmlns:p="http://schemas.microsoft.com/office/2006/metadata/properties" xmlns:ns1="http://schemas.microsoft.com/sharepoint/v3" xmlns:ns2="71af3243-3dd4-4a8d-8c0d-dd76da1f02a5" xmlns:ns3="16c05727-aa75-4e4a-9b5f-8a80a1165891" xmlns:ns4="230e9df3-be65-4c73-a93b-d1236ebd677e" targetNamespace="http://schemas.microsoft.com/office/2006/metadata/properties" ma:root="true" ma:fieldsID="ae00154c9e66547f022c4923f88826d6" ns1:_="" ns2:_="" ns3:_="" ns4:_="">
     <xsd:import namespace="http://schemas.microsoft.com/sharepoint/v3"/>
@@ -3897,35 +4070,40 @@
 </ct:contentTypeSchema>
 </file>
 
-<file path=customXml/itemProps1.xml><?xml version="1.0" encoding="utf-8"?>
-<ds:datastoreItem xmlns:ds="http://schemas.openxmlformats.org/officeDocument/2006/customXml" ds:itemID="{829E4964-E492-4D5C-A41E-6548D1BBBCF3}">
-  <ds:schemaRefs>
-    <ds:schemaRef ds:uri="http://schemas.openxmlformats.org/officeDocument/2006/bibliography"/>
-  </ds:schemaRefs>
-</ds:datastoreItem>
+<file path=customXml/item22.xml><?xml version="1.0" encoding="utf-8"?>
+<?mso-contentType ?>
+<FormTemplates xmlns="http://schemas.microsoft.com/sharepoint/v3/contenttype/forms">
+  <Display>DocumentLibraryForm</Display>
+  <Edit>DocumentLibraryForm</Edit>
+  <New>DocumentLibraryForm</New>
+</FormTemplates>
 </file>
 
-<file path=customXml/itemProps2.xml><?xml version="1.0" encoding="utf-8"?>
-<ds:datastoreItem xmlns:ds="http://schemas.openxmlformats.org/officeDocument/2006/customXml" ds:itemID="{FC286A1A-83A9-49D0-AE61-B506130901B0}">
-  <ds:schemaRefs>
-    <ds:schemaRef ds:uri="http://schemas.microsoft.com/office/2006/metadata/properties"/>
-    <ds:schemaRef ds:uri="http://schemas.microsoft.com/office/infopath/2007/PartnerControls"/>
-    <ds:schemaRef ds:uri="http://schemas.microsoft.com/sharepoint/v3"/>
-    <ds:schemaRef ds:uri="71af3243-3dd4-4a8d-8c0d-dd76da1f02a5"/>
-    <ds:schemaRef ds:uri="230e9df3-be65-4c73-a93b-d1236ebd677e"/>
-  </ds:schemaRefs>
-</ds:datastoreItem>
+<file path=customXml/item3.xml><?xml version="1.0" encoding="utf-8"?>
+<p:properties xmlns:p="http://schemas.microsoft.com/office/2006/metadata/properties" xmlns:xsi="http://www.w3.org/2001/XMLSchema-instance" xmlns:pc="http://schemas.microsoft.com/office/infopath/2007/PartnerControls">
+  <documentManagement>
+    <_ip_UnifiedCompliancePolicyUIAction xmlns="http://schemas.microsoft.com/sharepoint/v3" xsi:nil="true"/>
+    <Image xmlns="71af3243-3dd4-4a8d-8c0d-dd76da1f02a5">
+      <Url xsi:nil="true"/>
+      <Description xsi:nil="true"/>
+    </Image>
+    <Status xmlns="71af3243-3dd4-4a8d-8c0d-dd76da1f02a5">Not started</Status>
+    <_ip_UnifiedCompliancePolicyProperties xmlns="http://schemas.microsoft.com/sharepoint/v3" xsi:nil="true"/>
+    <ImageTagsTaxHTField xmlns="71af3243-3dd4-4a8d-8c0d-dd76da1f02a5">
+      <Terms xmlns="http://schemas.microsoft.com/office/infopath/2007/PartnerControls"/>
+    </ImageTagsTaxHTField>
+    <TaxCatchAll xmlns="230e9df3-be65-4c73-a93b-d1236ebd677e" xsi:nil="true"/>
+    <MediaServiceKeyPoints xmlns="71af3243-3dd4-4a8d-8c0d-dd76da1f02a5" xsi:nil="true"/>
+    <Background xmlns="71af3243-3dd4-4a8d-8c0d-dd76da1f02a5">false</Background>
+  </documentManagement>
+</p:properties>
 </file>
 
-<file path=customXml/itemProps3.xml><?xml version="1.0" encoding="utf-8"?>
-<ds:datastoreItem xmlns:ds="http://schemas.openxmlformats.org/officeDocument/2006/customXml" ds:itemID="{C03343B0-2E37-4E4D-9C2F-1BB515B811A5}">
-  <ds:schemaRefs>
-    <ds:schemaRef ds:uri="http://schemas.microsoft.com/sharepoint/v3/contenttype/forms"/>
-  </ds:schemaRefs>
-</ds:datastoreItem>
+<file path=customXml/item44.xml><?xml version="1.0" encoding="utf-8"?>
+<b:Sources xmlns:b="http://schemas.openxmlformats.org/officeDocument/2006/bibliography" xmlns="http://schemas.openxmlformats.org/officeDocument/2006/bibliography" SelectedStyle="\APASixthEditionOfficeOnline.xsl" StyleName="APA" Version="6"/>
 </file>
 
-<file path=customXml/itemProps4.xml><?xml version="1.0" encoding="utf-8"?>
+<file path=customXml/itemProps13.xml><?xml version="1.0" encoding="utf-8"?>
 <ds:datastoreItem xmlns:ds="http://schemas.openxmlformats.org/officeDocument/2006/customXml" ds:itemID="{204E295B-0C82-4E18-9B2C-12F2E12A709D}">
   <ds:schemaRefs>
     <ds:schemaRef ds:uri="http://schemas.microsoft.com/office/2006/metadata/contentType"/>
@@ -3946,6 +4124,34 @@
 </ds:datastoreItem>
 </file>
 
+<file path=customXml/itemProps22.xml><?xml version="1.0" encoding="utf-8"?>
+<ds:datastoreItem xmlns:ds="http://schemas.openxmlformats.org/officeDocument/2006/customXml" ds:itemID="{C03343B0-2E37-4E4D-9C2F-1BB515B811A5}">
+  <ds:schemaRefs>
+    <ds:schemaRef ds:uri="http://schemas.microsoft.com/sharepoint/v3/contenttype/forms"/>
+  </ds:schemaRefs>
+</ds:datastoreItem>
+</file>
+
+<file path=customXml/itemProps31.xml><?xml version="1.0" encoding="utf-8"?>
+<ds:datastoreItem xmlns:ds="http://schemas.openxmlformats.org/officeDocument/2006/customXml" ds:itemID="{FC286A1A-83A9-49D0-AE61-B506130901B0}">
+  <ds:schemaRefs>
+    <ds:schemaRef ds:uri="http://schemas.microsoft.com/office/2006/metadata/properties"/>
+    <ds:schemaRef ds:uri="http://schemas.microsoft.com/office/infopath/2007/PartnerControls"/>
+    <ds:schemaRef ds:uri="http://schemas.microsoft.com/sharepoint/v3"/>
+    <ds:schemaRef ds:uri="71af3243-3dd4-4a8d-8c0d-dd76da1f02a5"/>
+    <ds:schemaRef ds:uri="230e9df3-be65-4c73-a93b-d1236ebd677e"/>
+  </ds:schemaRefs>
+</ds:datastoreItem>
+</file>
+
+<file path=customXml/itemProps44.xml><?xml version="1.0" encoding="utf-8"?>
+<ds:datastoreItem xmlns:ds="http://schemas.openxmlformats.org/officeDocument/2006/customXml" ds:itemID="{829E4964-E492-4D5C-A41E-6548D1BBBCF3}">
+  <ds:schemaRefs>
+    <ds:schemaRef ds:uri="http://schemas.openxmlformats.org/officeDocument/2006/bibliography"/>
+  </ds:schemaRefs>
+</ds:datastoreItem>
+</file>
+
 <file path=docMetadata/LabelInfo.xml><?xml version="1.0" encoding="utf-8"?>
 <clbl:labelList xmlns:clbl="http://schemas.microsoft.com/office/2020/mipLabelMetadata"/>
 </file>
</xml_diff>